<commit_message>
feat: update login functionality and enhance dashboard layout for improved user experience
</commit_message>
<xml_diff>
--- a/需求说明书.docx
+++ b/需求说明书.docx
@@ -1161,7 +1161,6 @@
                 <w:bCs/>
               </w:rPr>
             </w:pPr>
-            <w:bookmarkStart w:id="0" w:name="_GoBack"/>
             <w:r>
               <w:rPr>
                 <w:b/>
@@ -1512,7 +1511,14 @@
           </w:tcPr>
           <w:p>
             <w:r>
-              <w:t>区分“预警”、“确认报警”、“紧急求救”等级别，通过声光、弹窗、多渠道即时推送给指挥官。</w:t>
+              <w:rPr>
+                <w:strike/>
+                <w:dstrike w:val="0"/>
+              </w:rPr>
+              <w:t>区分“预警”、“确认报警”、“紧急求救”等级别，</w:t>
+            </w:r>
+            <w:r>
+              <w:t>通过声光、弹窗、多渠道即时推送给指挥官。</w:t>
             </w:r>
           </w:p>
         </w:tc>
@@ -1593,7 +1599,6 @@
           </w:p>
         </w:tc>
       </w:tr>
-      <w:bookmarkEnd w:id="0"/>
     </w:tbl>
     <w:p/>
     <w:p>
@@ -2330,7 +2335,15 @@
               <w:rPr>
                 <w:highlight w:val="yellow"/>
               </w:rPr>
-              <w:t>丰富训练内容，实现标准化教学。</w:t>
+              <w:t>丰富训练内</w:t>
+            </w:r>
+            <w:bookmarkStart w:id="0" w:name="_GoBack"/>
+            <w:bookmarkEnd w:id="0"/>
+            <w:r>
+              <w:rPr>
+                <w:highlight w:val="yellow"/>
+              </w:rPr>
+              <w:t>容，实现标准化教学。</w:t>
             </w:r>
           </w:p>
         </w:tc>

</xml_diff>